<commit_message>
Final setup for 6/27 class...
</commit_message>
<xml_diff>
--- a/in-class/6-27 Class Material/Git_File_Recovery.docx
+++ b/in-class/6-27 Class Material/Git_File_Recovery.docx
@@ -33,6 +33,11 @@
           <w:iCs/>
         </w:rPr>
         <w:t>version</w:t>
+      </w:r>
+    </w:p>
+    <w:p>
+      <w:r>
+        <w:t>Note: Commit saves changes to files – not the files themselves</w:t>
       </w:r>
     </w:p>
     <w:p>
@@ -139,10 +144,7 @@
         </w:numPr>
       </w:pPr>
       <w:r>
-        <w:t xml:space="preserve">for this example, assume SHA is </w:t>
-      </w:r>
-      <w:r>
-        <w:t>9a45f121</w:t>
+        <w:t>for this example, assume SHA is 9a45f121</w:t>
       </w:r>
     </w:p>
     <w:p>
@@ -328,20 +330,34 @@
     <w:p/>
     <w:p>
       <w:r>
-        <w:t xml:space="preserve">The file is now saved to </w:t>
-      </w:r>
-      <w:r>
-        <w:t xml:space="preserve">the </w:t>
-      </w:r>
-      <w:r>
-        <w:t xml:space="preserve">current </w:t>
-      </w:r>
-      <w:r>
-        <w:t>commit of your project.</w:t>
+        <w:t xml:space="preserve">The </w:t>
+      </w:r>
+      <w:r>
+        <w:t xml:space="preserve">changed </w:t>
+      </w:r>
+      <w:r>
+        <w:t xml:space="preserve">file is now </w:t>
+      </w:r>
+      <w:r>
+        <w:t>in your</w:t>
+      </w:r>
+      <w:r>
+        <w:t xml:space="preserve"> current </w:t>
+      </w:r>
+      <w:r>
+        <w:t xml:space="preserve">Project and reflected in the Git tab and </w:t>
+      </w:r>
+      <w:r>
+        <w:t xml:space="preserve">can be </w:t>
+      </w:r>
+      <w:r>
+        <w:t>saved to the next Commit</w:t>
+      </w:r>
+      <w:r>
+        <w:t>.</w:t>
       </w:r>
     </w:p>
     <w:p/>
-    <w:p/>
     <w:p>
       <w:pPr>
         <w:rPr>
@@ -378,25 +394,33 @@
         <w:rPr>
           <w:u w:val="single"/>
         </w:rPr>
-        <w:t xml:space="preserve"> (the safest way – assume SHA is </w:t>
-      </w:r>
+        <w:t xml:space="preserve"> (the safest way – assume SHA </w:t>
+      </w:r>
+      <w:proofErr w:type="gramStart"/>
       <w:r>
         <w:rPr>
           <w:u w:val="single"/>
         </w:rPr>
+        <w:t xml:space="preserve">is </w:t>
+      </w:r>
+      <w:r>
+        <w:rPr>
+          <w:u w:val="single"/>
+        </w:rPr>
         <w:t xml:space="preserve"> </w:t>
       </w:r>
       <w:r>
         <w:rPr>
           <w:u w:val="single"/>
         </w:rPr>
-        <w:t>9a45f121</w:t>
-      </w:r>
+        <w:t>9</w:t>
+      </w:r>
+      <w:proofErr w:type="gramEnd"/>
       <w:r>
         <w:rPr>
           <w:u w:val="single"/>
         </w:rPr>
-        <w:t>)</w:t>
+        <w:t>a45f121)</w:t>
       </w:r>
     </w:p>
     <w:p>
@@ -438,7 +462,25 @@
           <w:bCs/>
           <w:color w:val="0070C0"/>
         </w:rPr>
-        <w:t>git revert --no-commit 9a45f121..HEAD</w:t>
+        <w:t>git revert --no-commit 9a45f</w:t>
+      </w:r>
+      <w:proofErr w:type="gramStart"/>
+      <w:r>
+        <w:rPr>
+          <w:b/>
+          <w:bCs/>
+          <w:color w:val="0070C0"/>
+        </w:rPr>
+        <w:t>121..</w:t>
+      </w:r>
+      <w:proofErr w:type="gramEnd"/>
+      <w:r>
+        <w:rPr>
+          <w:b/>
+          <w:bCs/>
+          <w:color w:val="0070C0"/>
+        </w:rPr>
+        <w:t>HEAD</w:t>
       </w:r>
     </w:p>
     <w:p/>
@@ -487,7 +529,23 @@
           <w:b/>
           <w:bCs/>
         </w:rPr>
-        <w:t>9a45f121..HEAD</w:t>
+        <w:t>9a45f</w:t>
+      </w:r>
+      <w:proofErr w:type="gramStart"/>
+      <w:r>
+        <w:rPr>
+          <w:b/>
+          <w:bCs/>
+        </w:rPr>
+        <w:t>121..</w:t>
+      </w:r>
+      <w:proofErr w:type="gramEnd"/>
+      <w:r>
+        <w:rPr>
+          <w:b/>
+          <w:bCs/>
+        </w:rPr>
+        <w:t>HEAD</w:t>
       </w:r>
       <w:r>
         <w:rPr>

</xml_diff>